<commit_message>
Entrega del 13-10: arquitectura 4+1, justificación de la innovación e índice de evidencias
- Nuevos en Archivos Word: 07 arquitectura 4+1, 08 justificación de la innovación y del piloto,
  09 índice de evidencias con capturas.
- Actualizados a v1.1 con las iteraciones 5 y 6: 01 metodología, 03 Product Backlog,
  04 Sprint Backlog y 06 retrospectivas.
- Capturas de evidencia (E1 a E9) con su LEEME y los cinco diagramas 4+1 en docs/diagramas.
- README: enlace al tablero Scrumban, sección de la arquitectura 4+1 y lista de documentos.

Co-Authored-By: Claude Sonnet 5.5 <noreply@anthropic.com>
</commit_message>
<xml_diff>
--- a/Fase 2/Evidencias Proyecto/Evidencias de documentación/Archivos Word/01_Metodologia_Declarada_y_Justificada.docx
+++ b/Fase 2/Evidencias Proyecto/Evidencias de documentación/Archivos Word/01_Metodologia_Declarada_y_Justificada.docx
@@ -318,7 +318,7 @@
               <w:rPr>
                 <w:sz w:val="19"/>
               </w:rPr>
-              <w:t>1.0 · 01-10-2026</w:t>
+              <w:t>1.1 · 10-10-2026</w:t>
             </w:r>
           </w:p>
         </w:tc>
@@ -644,7 +644,7 @@
               <w:rPr>
                 <w:sz w:val="18"/>
               </w:rPr>
-              <w:t>Un plan cerrado de requisitos habría quedado obsoleto; el backlog se volvió a priorizar en cada iteración</w:t>
+              <w:t>Un plan cerrado de requisitos habría quedado obsoleto; el backlog se repriorizó en cada iteración</w:t>
             </w:r>
           </w:p>
         </w:tc>
@@ -1693,7 +1693,7 @@
         <w:t>Tablero Kanban</w:t>
       </w:r>
       <w:r>
-        <w:t xml:space="preserve"> con tres estados: Pendiente, En curso y Hecho. Límite de trabajo en curso: </w:t>
+        <w:t xml:space="preserve"> con tres estados: Pendiente, En curso y Hecho, en GitHub Projects (enlace en la sección 6). Límite de trabajo en curso: </w:t>
       </w:r>
       <w:r>
         <w:rPr>
@@ -2325,9 +2325,9 @@
         <w:tblLayout w:type="fixed"/>
       </w:tblPr>
       <w:tblGrid>
-        <w:gridCol w:w="2834"/>
-        <w:gridCol w:w="1700"/>
-        <w:gridCol w:w="5436"/>
+        <w:gridCol w:w="3061"/>
+        <w:gridCol w:w="3741"/>
+        <w:gridCol w:w="3169"/>
       </w:tblGrid>
       <w:tr>
         <w:trPr>
@@ -2336,7 +2336,7 @@
         </w:trPr>
         <w:tc>
           <w:tcPr>
-            <w:tcW w:type="dxa" w:w="2835"/>
+            <w:tcW w:type="dxa" w:w="3061"/>
             <w:shd w:val="clear" w:color="auto" w:fill="3730A3"/>
             <w:vAlign w:val="center"/>
           </w:tcPr>
@@ -2357,7 +2357,7 @@
         </w:tc>
         <w:tc>
           <w:tcPr>
-            <w:tcW w:type="dxa" w:w="1701"/>
+            <w:tcW w:type="dxa" w:w="3742"/>
             <w:shd w:val="clear" w:color="auto" w:fill="3730A3"/>
             <w:vAlign w:val="center"/>
           </w:tcPr>
@@ -2378,7 +2378,7 @@
         </w:tc>
         <w:tc>
           <w:tcPr>
-            <w:tcW w:type="dxa" w:w="5437"/>
+            <w:tcW w:type="dxa" w:w="3169"/>
             <w:shd w:val="clear" w:color="auto" w:fill="3730A3"/>
             <w:vAlign w:val="center"/>
           </w:tcPr>
@@ -2404,12 +2404,11 @@
         </w:trPr>
         <w:tc>
           <w:tcPr>
-            <w:tcW w:type="dxa" w:w="2835"/>
+            <w:tcW w:type="dxa" w:w="3061"/>
             <w:vAlign w:val="top"/>
           </w:tcPr>
           <w:p>
             <w:pPr>
-              <w:keepNext/>
               <w:spacing w:after="0"/>
             </w:pPr>
             <w:r>
@@ -2422,12 +2421,11 @@
         </w:tc>
         <w:tc>
           <w:tcPr>
-            <w:tcW w:type="dxa" w:w="1701"/>
+            <w:tcW w:type="dxa" w:w="3742"/>
             <w:vAlign w:val="top"/>
           </w:tcPr>
           <w:p>
             <w:pPr>
-              <w:keepNext/>
               <w:spacing w:after="0"/>
             </w:pPr>
             <w:r>
@@ -2440,12 +2438,11 @@
         </w:tc>
         <w:tc>
           <w:tcPr>
-            <w:tcW w:type="dxa" w:w="5437"/>
+            <w:tcW w:type="dxa" w:w="3169"/>
             <w:vAlign w:val="top"/>
           </w:tcPr>
           <w:p>
             <w:pPr>
-              <w:keepNext/>
               <w:spacing w:after="0"/>
             </w:pPr>
             <w:r>
@@ -2463,13 +2460,12 @@
         </w:trPr>
         <w:tc>
           <w:tcPr>
-            <w:tcW w:type="dxa" w:w="2835"/>
+            <w:tcW w:type="dxa" w:w="3061"/>
             <w:vAlign w:val="top"/>
             <w:shd w:val="clear" w:color="auto" w:fill="F8FAFC"/>
           </w:tcPr>
           <w:p>
             <w:pPr>
-              <w:keepNext/>
               <w:spacing w:after="0"/>
             </w:pPr>
             <w:r>
@@ -2482,13 +2478,12 @@
         </w:tc>
         <w:tc>
           <w:tcPr>
-            <w:tcW w:type="dxa" w:w="1701"/>
+            <w:tcW w:type="dxa" w:w="3742"/>
             <w:vAlign w:val="top"/>
             <w:shd w:val="clear" w:color="auto" w:fill="F8FAFC"/>
           </w:tcPr>
           <w:p>
             <w:pPr>
-              <w:keepNext/>
               <w:spacing w:after="0"/>
             </w:pPr>
             <w:r>
@@ -2501,13 +2496,12 @@
         </w:tc>
         <w:tc>
           <w:tcPr>
-            <w:tcW w:type="dxa" w:w="5437"/>
+            <w:tcW w:type="dxa" w:w="3169"/>
             <w:vAlign w:val="top"/>
             <w:shd w:val="clear" w:color="auto" w:fill="F8FAFC"/>
           </w:tcPr>
           <w:p>
             <w:pPr>
-              <w:keepNext/>
               <w:spacing w:after="0"/>
             </w:pPr>
             <w:r>
@@ -2525,12 +2519,11 @@
         </w:trPr>
         <w:tc>
           <w:tcPr>
-            <w:tcW w:type="dxa" w:w="2835"/>
+            <w:tcW w:type="dxa" w:w="3061"/>
             <w:vAlign w:val="top"/>
           </w:tcPr>
           <w:p>
             <w:pPr>
-              <w:keepNext/>
               <w:spacing w:after="0"/>
             </w:pPr>
             <w:r>
@@ -2543,12 +2536,11 @@
         </w:tc>
         <w:tc>
           <w:tcPr>
-            <w:tcW w:type="dxa" w:w="1701"/>
+            <w:tcW w:type="dxa" w:w="3742"/>
             <w:vAlign w:val="top"/>
           </w:tcPr>
           <w:p>
             <w:pPr>
-              <w:keepNext/>
               <w:spacing w:after="0"/>
             </w:pPr>
             <w:r>
@@ -2561,12 +2553,11 @@
         </w:tc>
         <w:tc>
           <w:tcPr>
-            <w:tcW w:type="dxa" w:w="5437"/>
+            <w:tcW w:type="dxa" w:w="3169"/>
             <w:vAlign w:val="top"/>
           </w:tcPr>
           <w:p>
             <w:pPr>
-              <w:keepNext/>
               <w:spacing w:after="0"/>
             </w:pPr>
             <w:r>
@@ -2584,13 +2575,12 @@
         </w:trPr>
         <w:tc>
           <w:tcPr>
-            <w:tcW w:type="dxa" w:w="2835"/>
+            <w:tcW w:type="dxa" w:w="3061"/>
             <w:vAlign w:val="top"/>
             <w:shd w:val="clear" w:color="auto" w:fill="F8FAFC"/>
           </w:tcPr>
           <w:p>
             <w:pPr>
-              <w:keepNext/>
               <w:spacing w:after="0"/>
             </w:pPr>
             <w:r>
@@ -2603,13 +2593,12 @@
         </w:tc>
         <w:tc>
           <w:tcPr>
-            <w:tcW w:type="dxa" w:w="1701"/>
+            <w:tcW w:type="dxa" w:w="3742"/>
             <w:vAlign w:val="top"/>
             <w:shd w:val="clear" w:color="auto" w:fill="F8FAFC"/>
           </w:tcPr>
           <w:p>
             <w:pPr>
-              <w:keepNext/>
               <w:spacing w:after="0"/>
             </w:pPr>
             <w:r>
@@ -2622,13 +2611,12 @@
         </w:tc>
         <w:tc>
           <w:tcPr>
-            <w:tcW w:type="dxa" w:w="5437"/>
+            <w:tcW w:type="dxa" w:w="3169"/>
             <w:vAlign w:val="top"/>
             <w:shd w:val="clear" w:color="auto" w:fill="F8FAFC"/>
           </w:tcPr>
           <w:p>
             <w:pPr>
-              <w:keepNext/>
               <w:spacing w:after="0"/>
             </w:pPr>
             <w:r>
@@ -2646,7 +2634,7 @@
         </w:trPr>
         <w:tc>
           <w:tcPr>
-            <w:tcW w:type="dxa" w:w="2835"/>
+            <w:tcW w:type="dxa" w:w="3061"/>
             <w:vAlign w:val="top"/>
           </w:tcPr>
           <w:p>
@@ -2663,7 +2651,7 @@
         </w:tc>
         <w:tc>
           <w:tcPr>
-            <w:tcW w:type="dxa" w:w="1701"/>
+            <w:tcW w:type="dxa" w:w="3742"/>
             <w:vAlign w:val="top"/>
           </w:tcPr>
           <w:p>
@@ -2680,7 +2668,7 @@
         </w:tc>
         <w:tc>
           <w:tcPr>
-            <w:tcW w:type="dxa" w:w="5437"/>
+            <w:tcW w:type="dxa" w:w="3169"/>
             <w:vAlign w:val="top"/>
           </w:tcPr>
           <w:p>
@@ -2692,6 +2680,236 @@
                 <w:sz w:val="18"/>
               </w:rPr>
               <w:t>Al cerrar cada iteración</w:t>
+            </w:r>
+          </w:p>
+        </w:tc>
+      </w:tr>
+      <w:tr>
+        <w:trPr>
+          <w:cantSplit/>
+        </w:trPr>
+        <w:tc>
+          <w:tcPr>
+            <w:tcW w:type="dxa" w:w="3061"/>
+            <w:vAlign w:val="top"/>
+            <w:shd w:val="clear" w:color="auto" w:fill="F8FAFC"/>
+          </w:tcPr>
+          <w:p>
+            <w:pPr>
+              <w:spacing w:after="0"/>
+            </w:pPr>
+            <w:r>
+              <w:rPr>
+                <w:sz w:val="18"/>
+              </w:rPr>
+              <w:t>Arquitectura del sistema (4+1)</w:t>
+            </w:r>
+          </w:p>
+        </w:tc>
+        <w:tc>
+          <w:tcPr>
+            <w:tcW w:type="dxa" w:w="3742"/>
+            <w:vAlign w:val="top"/>
+            <w:shd w:val="clear" w:color="auto" w:fill="F8FAFC"/>
+          </w:tcPr>
+          <w:p>
+            <w:pPr>
+              <w:spacing w:after="0"/>
+            </w:pPr>
+            <w:r>
+              <w:rPr>
+                <w:sz w:val="18"/>
+              </w:rPr>
+              <w:t>REV-07</w:t>
+            </w:r>
+          </w:p>
+        </w:tc>
+        <w:tc>
+          <w:tcPr>
+            <w:tcW w:type="dxa" w:w="3169"/>
+            <w:vAlign w:val="top"/>
+            <w:shd w:val="clear" w:color="auto" w:fill="F8FAFC"/>
+          </w:tcPr>
+          <w:p>
+            <w:pPr>
+              <w:spacing w:after="0"/>
+            </w:pPr>
+            <w:r>
+              <w:rPr>
+                <w:sz w:val="18"/>
+              </w:rPr>
+              <w:t>Cuando cambia la arquitectura publicada</w:t>
+            </w:r>
+          </w:p>
+        </w:tc>
+      </w:tr>
+      <w:tr>
+        <w:trPr>
+          <w:cantSplit/>
+        </w:trPr>
+        <w:tc>
+          <w:tcPr>
+            <w:tcW w:type="dxa" w:w="3061"/>
+            <w:vAlign w:val="top"/>
+          </w:tcPr>
+          <w:p>
+            <w:pPr>
+              <w:spacing w:after="0"/>
+            </w:pPr>
+            <w:r>
+              <w:rPr>
+                <w:sz w:val="18"/>
+              </w:rPr>
+              <w:t>Justificación de la innovación y del piloto</w:t>
+            </w:r>
+          </w:p>
+        </w:tc>
+        <w:tc>
+          <w:tcPr>
+            <w:tcW w:type="dxa" w:w="3742"/>
+            <w:vAlign w:val="top"/>
+          </w:tcPr>
+          <w:p>
+            <w:pPr>
+              <w:spacing w:after="0"/>
+            </w:pPr>
+            <w:r>
+              <w:rPr>
+                <w:sz w:val="18"/>
+              </w:rPr>
+              <w:t>REV-08</w:t>
+            </w:r>
+          </w:p>
+        </w:tc>
+        <w:tc>
+          <w:tcPr>
+            <w:tcW w:type="dxa" w:w="3169"/>
+            <w:vAlign w:val="top"/>
+          </w:tcPr>
+          <w:p>
+            <w:pPr>
+              <w:spacing w:after="0"/>
+            </w:pPr>
+            <w:r>
+              <w:rPr>
+                <w:sz w:val="18"/>
+              </w:rPr>
+              <w:t>Con cada medición del piloto</w:t>
+            </w:r>
+          </w:p>
+        </w:tc>
+      </w:tr>
+      <w:tr>
+        <w:trPr>
+          <w:cantSplit/>
+        </w:trPr>
+        <w:tc>
+          <w:tcPr>
+            <w:tcW w:type="dxa" w:w="3061"/>
+            <w:vAlign w:val="top"/>
+            <w:shd w:val="clear" w:color="auto" w:fill="F8FAFC"/>
+          </w:tcPr>
+          <w:p>
+            <w:pPr>
+              <w:spacing w:after="0"/>
+            </w:pPr>
+            <w:r>
+              <w:rPr>
+                <w:sz w:val="18"/>
+              </w:rPr>
+              <w:t>Índice de evidencias con capturas</w:t>
+            </w:r>
+          </w:p>
+        </w:tc>
+        <w:tc>
+          <w:tcPr>
+            <w:tcW w:type="dxa" w:w="3742"/>
+            <w:vAlign w:val="top"/>
+            <w:shd w:val="clear" w:color="auto" w:fill="F8FAFC"/>
+          </w:tcPr>
+          <w:p>
+            <w:pPr>
+              <w:spacing w:after="0"/>
+            </w:pPr>
+            <w:r>
+              <w:rPr>
+                <w:sz w:val="18"/>
+              </w:rPr>
+              <w:t>REV-09</w:t>
+            </w:r>
+          </w:p>
+        </w:tc>
+        <w:tc>
+          <w:tcPr>
+            <w:tcW w:type="dxa" w:w="3169"/>
+            <w:vAlign w:val="top"/>
+            <w:shd w:val="clear" w:color="auto" w:fill="F8FAFC"/>
+          </w:tcPr>
+          <w:p>
+            <w:pPr>
+              <w:spacing w:after="0"/>
+            </w:pPr>
+            <w:r>
+              <w:rPr>
+                <w:sz w:val="18"/>
+              </w:rPr>
+              <w:t>Antes de cada entrega</w:t>
+            </w:r>
+          </w:p>
+        </w:tc>
+      </w:tr>
+      <w:tr>
+        <w:trPr>
+          <w:cantSplit/>
+        </w:trPr>
+        <w:tc>
+          <w:tcPr>
+            <w:tcW w:type="dxa" w:w="3061"/>
+            <w:vAlign w:val="top"/>
+          </w:tcPr>
+          <w:p>
+            <w:pPr>
+              <w:spacing w:after="0"/>
+            </w:pPr>
+            <w:r>
+              <w:rPr>
+                <w:sz w:val="18"/>
+              </w:rPr>
+              <w:t>Tablero Scrumban (GitHub Projects)</w:t>
+            </w:r>
+          </w:p>
+        </w:tc>
+        <w:tc>
+          <w:tcPr>
+            <w:tcW w:type="dxa" w:w="3742"/>
+            <w:vAlign w:val="top"/>
+          </w:tcPr>
+          <w:p>
+            <w:pPr>
+              <w:spacing w:after="0"/>
+            </w:pPr>
+            <w:r>
+              <w:rPr>
+                <w:sz w:val="18"/>
+              </w:rPr>
+              <w:t>github.com/users/YairCosta/projects/1</w:t>
+            </w:r>
+          </w:p>
+        </w:tc>
+        <w:tc>
+          <w:tcPr>
+            <w:tcW w:type="dxa" w:w="3169"/>
+            <w:vAlign w:val="top"/>
+          </w:tcPr>
+          <w:p>
+            <w:pPr>
+              <w:spacing w:after="0"/>
+            </w:pPr>
+            <w:r>
+              <w:rPr>
+                <w:sz w:val="18"/>
+              </w:rPr>
+              <w:t>Cada vez que una historia cambia de estado</w:t>
             </w:r>
           </w:p>
         </w:tc>
@@ -2823,7 +3041,7 @@
               <w:rPr>
                 <w:sz w:val="18"/>
               </w:rPr>
-              <w:t>Pruebas automáticas (727 comprobaciones entre todas las suites), revisión de seguridad por casos de uso y pruebas de ataque contra la base real</w:t>
+              <w:t>Pruebas automáticas (848 comprobaciones entre todas las suites), revisión de seguridad por casos de uso y pruebas de ataque contra la base real</w:t>
             </w:r>
           </w:p>
         </w:tc>
@@ -2920,6 +3138,96 @@
                 <w:sz w:val="18"/>
               </w:rPr>
               <w:t xml:space="preserve"> (base de datos, seguridad, asistente de IA, despliegue)</w:t>
+            </w:r>
+          </w:p>
+        </w:tc>
+      </w:tr>
+    </w:tbl>
+    <w:p>
+      <w:pPr>
+        <w:spacing w:after="0" w:before="0" w:line="120" w:lineRule="exact"/>
+      </w:pPr>
+      <w:r>
+        <w:rPr>
+          <w:sz w:val="12"/>
+        </w:rPr>
+      </w:r>
+    </w:p>
+    <w:p>
+      <w:pPr>
+        <w:pStyle w:val="Heading1"/>
+      </w:pPr>
+      <w:r>
+        <w:t>8. Nota de transparencia</w:t>
+      </w:r>
+    </w:p>
+    <w:tbl>
+      <w:tblPr>
+        <w:tblW w:type="dxa" w:w="9972"/>
+        <w:tblLook w:firstColumn="1" w:firstRow="1" w:lastColumn="0" w:lastRow="0" w:noHBand="0" w:noVBand="1" w:val="04A0"/>
+        <w:tblBorders>
+          <w:top w:val="single" w:sz="6" w:space="0" w:color="C2410C"/>
+          <w:left w:val="single" w:sz="6" w:space="0" w:color="C2410C"/>
+          <w:bottom w:val="single" w:sz="6" w:space="0" w:color="C2410C"/>
+          <w:right w:val="single" w:sz="6" w:space="0" w:color="C2410C"/>
+          <w:insideH w:val="single" w:sz="6" w:space="0" w:color="C2410C"/>
+          <w:insideV w:val="single" w:sz="6" w:space="0" w:color="C2410C"/>
+        </w:tblBorders>
+        <w:tblCellMar>
+          <w:top w:w="100" w:type="dxa"/>
+          <w:left w:w="160" w:type="dxa"/>
+          <w:bottom w:w="100" w:type="dxa"/>
+          <w:right w:w="160" w:type="dxa"/>
+        </w:tblCellMar>
+        <w:tblLayout w:type="fixed"/>
+      </w:tblPr>
+      <w:tblGrid>
+        <w:gridCol w:w="9972"/>
+      </w:tblGrid>
+      <w:tr>
+        <w:trPr>
+          <w:cantSplit/>
+        </w:trPr>
+        <w:tc>
+          <w:tcPr>
+            <w:tcW w:type="dxa" w:w="9972"/>
+            <w:shd w:val="clear" w:color="auto" w:fill="FFF7ED"/>
+          </w:tcPr>
+          <w:p>
+            <w:pPr>
+              <w:spacing w:after="40"/>
+            </w:pPr>
+            <w:r>
+              <w:rPr>
+                <w:sz w:val="21"/>
+              </w:rPr>
+              <w:t xml:space="preserve">El </w:t>
+            </w:r>
+            <w:r>
+              <w:rPr>
+                <w:b/>
+                <w:sz w:val="21"/>
+              </w:rPr>
+              <w:t>Sprint Backlog</w:t>
+            </w:r>
+            <w:r>
+              <w:rPr>
+                <w:sz w:val="21"/>
+              </w:rPr>
+              <w:t xml:space="preserve"> se reconstruyó desde el historial real de Git y las </w:t>
+            </w:r>
+            <w:r>
+              <w:rPr>
+                <w:b/>
+                <w:sz w:val="21"/>
+              </w:rPr>
+              <w:t>retrospectivas</w:t>
+            </w:r>
+            <w:r>
+              <w:rPr>
+                <w:sz w:val="21"/>
+              </w:rPr>
+              <w:t xml:space="preserve"> de las iteraciones 2 a 4 se redactaron el 01-10-2026 a partir de ese historial y de los documentos del proyecto: los hechos y las mejoras son reales, pero no se registraron en una reunión al cierre de cada iteración. Las de las iteraciones 5 y 6 también se redactaron el 10-10-2026 con el mismo criterio. Desde la iteración 7 la retrospectiva se registra al cerrar la iteración.</w:t>
             </w:r>
           </w:p>
         </w:tc>

</xml_diff>

<commit_message>
Entrega 13-10-2026: arquitectura 4+1
Co-Authored-By: Claude Sonnet 5.5 <noreply@anthropic.com>
</commit_message>
<xml_diff>
--- a/Fase 2/Evidencias Proyecto/Evidencias de documentación/Archivos Word/01_Metodologia_Declarada_y_Justificada.docx
+++ b/Fase 2/Evidencias Proyecto/Evidencias de documentación/Archivos Word/01_Metodologia_Declarada_y_Justificada.docx
@@ -318,7 +318,7 @@
               <w:rPr>
                 <w:sz w:val="19"/>
               </w:rPr>
-              <w:t>1.1 · 10-10-2026</w:t>
+              <w:t>1.0 · 01-10-2026</w:t>
             </w:r>
           </w:p>
         </w:tc>
@@ -644,7 +644,7 @@
               <w:rPr>
                 <w:sz w:val="18"/>
               </w:rPr>
-              <w:t>Un plan cerrado de requisitos habría quedado obsoleto; el backlog se repriorizó en cada iteración</w:t>
+              <w:t>Un plan cerrado de requisitos habría quedado obsoleto; el backlog se volvió a priorizar en cada iteración</w:t>
             </w:r>
           </w:p>
         </w:tc>
@@ -1693,7 +1693,7 @@
         <w:t>Tablero Kanban</w:t>
       </w:r>
       <w:r>
-        <w:t xml:space="preserve"> con tres estados: Pendiente, En curso y Hecho, en GitHub Projects (enlace en la sección 6). Límite de trabajo en curso: </w:t>
+        <w:t xml:space="preserve"> con tres estados: Pendiente, En curso y Hecho. Límite de trabajo en curso: </w:t>
       </w:r>
       <w:r>
         <w:rPr>
@@ -2325,9 +2325,9 @@
         <w:tblLayout w:type="fixed"/>
       </w:tblPr>
       <w:tblGrid>
-        <w:gridCol w:w="3061"/>
-        <w:gridCol w:w="3741"/>
-        <w:gridCol w:w="3169"/>
+        <w:gridCol w:w="2834"/>
+        <w:gridCol w:w="1700"/>
+        <w:gridCol w:w="5436"/>
       </w:tblGrid>
       <w:tr>
         <w:trPr>
@@ -2336,7 +2336,7 @@
         </w:trPr>
         <w:tc>
           <w:tcPr>
-            <w:tcW w:type="dxa" w:w="3061"/>
+            <w:tcW w:type="dxa" w:w="2835"/>
             <w:shd w:val="clear" w:color="auto" w:fill="3730A3"/>
             <w:vAlign w:val="center"/>
           </w:tcPr>
@@ -2357,7 +2357,7 @@
         </w:tc>
         <w:tc>
           <w:tcPr>
-            <w:tcW w:type="dxa" w:w="3742"/>
+            <w:tcW w:type="dxa" w:w="1701"/>
             <w:shd w:val="clear" w:color="auto" w:fill="3730A3"/>
             <w:vAlign w:val="center"/>
           </w:tcPr>
@@ -2378,7 +2378,7 @@
         </w:tc>
         <w:tc>
           <w:tcPr>
-            <w:tcW w:type="dxa" w:w="3169"/>
+            <w:tcW w:type="dxa" w:w="5437"/>
             <w:shd w:val="clear" w:color="auto" w:fill="3730A3"/>
             <w:vAlign w:val="center"/>
           </w:tcPr>
@@ -2404,11 +2404,12 @@
         </w:trPr>
         <w:tc>
           <w:tcPr>
-            <w:tcW w:type="dxa" w:w="3061"/>
+            <w:tcW w:type="dxa" w:w="2835"/>
             <w:vAlign w:val="top"/>
           </w:tcPr>
           <w:p>
             <w:pPr>
+              <w:keepNext/>
               <w:spacing w:after="0"/>
             </w:pPr>
             <w:r>
@@ -2421,11 +2422,12 @@
         </w:tc>
         <w:tc>
           <w:tcPr>
-            <w:tcW w:type="dxa" w:w="3742"/>
+            <w:tcW w:type="dxa" w:w="1701"/>
             <w:vAlign w:val="top"/>
           </w:tcPr>
           <w:p>
             <w:pPr>
+              <w:keepNext/>
               <w:spacing w:after="0"/>
             </w:pPr>
             <w:r>
@@ -2438,11 +2440,12 @@
         </w:tc>
         <w:tc>
           <w:tcPr>
-            <w:tcW w:type="dxa" w:w="3169"/>
+            <w:tcW w:type="dxa" w:w="5437"/>
             <w:vAlign w:val="top"/>
           </w:tcPr>
           <w:p>
             <w:pPr>
+              <w:keepNext/>
               <w:spacing w:after="0"/>
             </w:pPr>
             <w:r>
@@ -2460,12 +2463,13 @@
         </w:trPr>
         <w:tc>
           <w:tcPr>
-            <w:tcW w:type="dxa" w:w="3061"/>
+            <w:tcW w:type="dxa" w:w="2835"/>
             <w:vAlign w:val="top"/>
             <w:shd w:val="clear" w:color="auto" w:fill="F8FAFC"/>
           </w:tcPr>
           <w:p>
             <w:pPr>
+              <w:keepNext/>
               <w:spacing w:after="0"/>
             </w:pPr>
             <w:r>
@@ -2478,12 +2482,13 @@
         </w:tc>
         <w:tc>
           <w:tcPr>
-            <w:tcW w:type="dxa" w:w="3742"/>
+            <w:tcW w:type="dxa" w:w="1701"/>
             <w:vAlign w:val="top"/>
             <w:shd w:val="clear" w:color="auto" w:fill="F8FAFC"/>
           </w:tcPr>
           <w:p>
             <w:pPr>
+              <w:keepNext/>
               <w:spacing w:after="0"/>
             </w:pPr>
             <w:r>
@@ -2496,12 +2501,13 @@
         </w:tc>
         <w:tc>
           <w:tcPr>
-            <w:tcW w:type="dxa" w:w="3169"/>
+            <w:tcW w:type="dxa" w:w="5437"/>
             <w:vAlign w:val="top"/>
             <w:shd w:val="clear" w:color="auto" w:fill="F8FAFC"/>
           </w:tcPr>
           <w:p>
             <w:pPr>
+              <w:keepNext/>
               <w:spacing w:after="0"/>
             </w:pPr>
             <w:r>
@@ -2519,11 +2525,12 @@
         </w:trPr>
         <w:tc>
           <w:tcPr>
-            <w:tcW w:type="dxa" w:w="3061"/>
+            <w:tcW w:type="dxa" w:w="2835"/>
             <w:vAlign w:val="top"/>
           </w:tcPr>
           <w:p>
             <w:pPr>
+              <w:keepNext/>
               <w:spacing w:after="0"/>
             </w:pPr>
             <w:r>
@@ -2536,11 +2543,12 @@
         </w:tc>
         <w:tc>
           <w:tcPr>
-            <w:tcW w:type="dxa" w:w="3742"/>
+            <w:tcW w:type="dxa" w:w="1701"/>
             <w:vAlign w:val="top"/>
           </w:tcPr>
           <w:p>
             <w:pPr>
+              <w:keepNext/>
               <w:spacing w:after="0"/>
             </w:pPr>
             <w:r>
@@ -2553,11 +2561,12 @@
         </w:tc>
         <w:tc>
           <w:tcPr>
-            <w:tcW w:type="dxa" w:w="3169"/>
+            <w:tcW w:type="dxa" w:w="5437"/>
             <w:vAlign w:val="top"/>
           </w:tcPr>
           <w:p>
             <w:pPr>
+              <w:keepNext/>
               <w:spacing w:after="0"/>
             </w:pPr>
             <w:r>
@@ -2575,12 +2584,13 @@
         </w:trPr>
         <w:tc>
           <w:tcPr>
-            <w:tcW w:type="dxa" w:w="3061"/>
+            <w:tcW w:type="dxa" w:w="2835"/>
             <w:vAlign w:val="top"/>
             <w:shd w:val="clear" w:color="auto" w:fill="F8FAFC"/>
           </w:tcPr>
           <w:p>
             <w:pPr>
+              <w:keepNext/>
               <w:spacing w:after="0"/>
             </w:pPr>
             <w:r>
@@ -2593,12 +2603,13 @@
         </w:tc>
         <w:tc>
           <w:tcPr>
-            <w:tcW w:type="dxa" w:w="3742"/>
+            <w:tcW w:type="dxa" w:w="1701"/>
             <w:vAlign w:val="top"/>
             <w:shd w:val="clear" w:color="auto" w:fill="F8FAFC"/>
           </w:tcPr>
           <w:p>
             <w:pPr>
+              <w:keepNext/>
               <w:spacing w:after="0"/>
             </w:pPr>
             <w:r>
@@ -2611,12 +2622,13 @@
         </w:tc>
         <w:tc>
           <w:tcPr>
-            <w:tcW w:type="dxa" w:w="3169"/>
+            <w:tcW w:type="dxa" w:w="5437"/>
             <w:vAlign w:val="top"/>
             <w:shd w:val="clear" w:color="auto" w:fill="F8FAFC"/>
           </w:tcPr>
           <w:p>
             <w:pPr>
+              <w:keepNext/>
               <w:spacing w:after="0"/>
             </w:pPr>
             <w:r>
@@ -2634,7 +2646,7 @@
         </w:trPr>
         <w:tc>
           <w:tcPr>
-            <w:tcW w:type="dxa" w:w="3061"/>
+            <w:tcW w:type="dxa" w:w="2835"/>
             <w:vAlign w:val="top"/>
           </w:tcPr>
           <w:p>
@@ -2651,7 +2663,7 @@
         </w:tc>
         <w:tc>
           <w:tcPr>
-            <w:tcW w:type="dxa" w:w="3742"/>
+            <w:tcW w:type="dxa" w:w="1701"/>
             <w:vAlign w:val="top"/>
           </w:tcPr>
           <w:p>
@@ -2668,7 +2680,7 @@
         </w:tc>
         <w:tc>
           <w:tcPr>
-            <w:tcW w:type="dxa" w:w="3169"/>
+            <w:tcW w:type="dxa" w:w="5437"/>
             <w:vAlign w:val="top"/>
           </w:tcPr>
           <w:p>
@@ -2680,236 +2692,6 @@
                 <w:sz w:val="18"/>
               </w:rPr>
               <w:t>Al cerrar cada iteración</w:t>
-            </w:r>
-          </w:p>
-        </w:tc>
-      </w:tr>
-      <w:tr>
-        <w:trPr>
-          <w:cantSplit/>
-        </w:trPr>
-        <w:tc>
-          <w:tcPr>
-            <w:tcW w:type="dxa" w:w="3061"/>
-            <w:vAlign w:val="top"/>
-            <w:shd w:val="clear" w:color="auto" w:fill="F8FAFC"/>
-          </w:tcPr>
-          <w:p>
-            <w:pPr>
-              <w:spacing w:after="0"/>
-            </w:pPr>
-            <w:r>
-              <w:rPr>
-                <w:sz w:val="18"/>
-              </w:rPr>
-              <w:t>Arquitectura del sistema (4+1)</w:t>
-            </w:r>
-          </w:p>
-        </w:tc>
-        <w:tc>
-          <w:tcPr>
-            <w:tcW w:type="dxa" w:w="3742"/>
-            <w:vAlign w:val="top"/>
-            <w:shd w:val="clear" w:color="auto" w:fill="F8FAFC"/>
-          </w:tcPr>
-          <w:p>
-            <w:pPr>
-              <w:spacing w:after="0"/>
-            </w:pPr>
-            <w:r>
-              <w:rPr>
-                <w:sz w:val="18"/>
-              </w:rPr>
-              <w:t>REV-07</w:t>
-            </w:r>
-          </w:p>
-        </w:tc>
-        <w:tc>
-          <w:tcPr>
-            <w:tcW w:type="dxa" w:w="3169"/>
-            <w:vAlign w:val="top"/>
-            <w:shd w:val="clear" w:color="auto" w:fill="F8FAFC"/>
-          </w:tcPr>
-          <w:p>
-            <w:pPr>
-              <w:spacing w:after="0"/>
-            </w:pPr>
-            <w:r>
-              <w:rPr>
-                <w:sz w:val="18"/>
-              </w:rPr>
-              <w:t>Cuando cambia la arquitectura publicada</w:t>
-            </w:r>
-          </w:p>
-        </w:tc>
-      </w:tr>
-      <w:tr>
-        <w:trPr>
-          <w:cantSplit/>
-        </w:trPr>
-        <w:tc>
-          <w:tcPr>
-            <w:tcW w:type="dxa" w:w="3061"/>
-            <w:vAlign w:val="top"/>
-          </w:tcPr>
-          <w:p>
-            <w:pPr>
-              <w:spacing w:after="0"/>
-            </w:pPr>
-            <w:r>
-              <w:rPr>
-                <w:sz w:val="18"/>
-              </w:rPr>
-              <w:t>Justificación de la innovación y del piloto</w:t>
-            </w:r>
-          </w:p>
-        </w:tc>
-        <w:tc>
-          <w:tcPr>
-            <w:tcW w:type="dxa" w:w="3742"/>
-            <w:vAlign w:val="top"/>
-          </w:tcPr>
-          <w:p>
-            <w:pPr>
-              <w:spacing w:after="0"/>
-            </w:pPr>
-            <w:r>
-              <w:rPr>
-                <w:sz w:val="18"/>
-              </w:rPr>
-              <w:t>REV-08</w:t>
-            </w:r>
-          </w:p>
-        </w:tc>
-        <w:tc>
-          <w:tcPr>
-            <w:tcW w:type="dxa" w:w="3169"/>
-            <w:vAlign w:val="top"/>
-          </w:tcPr>
-          <w:p>
-            <w:pPr>
-              <w:spacing w:after="0"/>
-            </w:pPr>
-            <w:r>
-              <w:rPr>
-                <w:sz w:val="18"/>
-              </w:rPr>
-              <w:t>Con cada medición del piloto</w:t>
-            </w:r>
-          </w:p>
-        </w:tc>
-      </w:tr>
-      <w:tr>
-        <w:trPr>
-          <w:cantSplit/>
-        </w:trPr>
-        <w:tc>
-          <w:tcPr>
-            <w:tcW w:type="dxa" w:w="3061"/>
-            <w:vAlign w:val="top"/>
-            <w:shd w:val="clear" w:color="auto" w:fill="F8FAFC"/>
-          </w:tcPr>
-          <w:p>
-            <w:pPr>
-              <w:spacing w:after="0"/>
-            </w:pPr>
-            <w:r>
-              <w:rPr>
-                <w:sz w:val="18"/>
-              </w:rPr>
-              <w:t>Índice de evidencias con capturas</w:t>
-            </w:r>
-          </w:p>
-        </w:tc>
-        <w:tc>
-          <w:tcPr>
-            <w:tcW w:type="dxa" w:w="3742"/>
-            <w:vAlign w:val="top"/>
-            <w:shd w:val="clear" w:color="auto" w:fill="F8FAFC"/>
-          </w:tcPr>
-          <w:p>
-            <w:pPr>
-              <w:spacing w:after="0"/>
-            </w:pPr>
-            <w:r>
-              <w:rPr>
-                <w:sz w:val="18"/>
-              </w:rPr>
-              <w:t>REV-09</w:t>
-            </w:r>
-          </w:p>
-        </w:tc>
-        <w:tc>
-          <w:tcPr>
-            <w:tcW w:type="dxa" w:w="3169"/>
-            <w:vAlign w:val="top"/>
-            <w:shd w:val="clear" w:color="auto" w:fill="F8FAFC"/>
-          </w:tcPr>
-          <w:p>
-            <w:pPr>
-              <w:spacing w:after="0"/>
-            </w:pPr>
-            <w:r>
-              <w:rPr>
-                <w:sz w:val="18"/>
-              </w:rPr>
-              <w:t>Antes de cada entrega</w:t>
-            </w:r>
-          </w:p>
-        </w:tc>
-      </w:tr>
-      <w:tr>
-        <w:trPr>
-          <w:cantSplit/>
-        </w:trPr>
-        <w:tc>
-          <w:tcPr>
-            <w:tcW w:type="dxa" w:w="3061"/>
-            <w:vAlign w:val="top"/>
-          </w:tcPr>
-          <w:p>
-            <w:pPr>
-              <w:spacing w:after="0"/>
-            </w:pPr>
-            <w:r>
-              <w:rPr>
-                <w:sz w:val="18"/>
-              </w:rPr>
-              <w:t>Tablero Scrumban (GitHub Projects)</w:t>
-            </w:r>
-          </w:p>
-        </w:tc>
-        <w:tc>
-          <w:tcPr>
-            <w:tcW w:type="dxa" w:w="3742"/>
-            <w:vAlign w:val="top"/>
-          </w:tcPr>
-          <w:p>
-            <w:pPr>
-              <w:spacing w:after="0"/>
-            </w:pPr>
-            <w:r>
-              <w:rPr>
-                <w:sz w:val="18"/>
-              </w:rPr>
-              <w:t>github.com/users/YairCosta/projects/1</w:t>
-            </w:r>
-          </w:p>
-        </w:tc>
-        <w:tc>
-          <w:tcPr>
-            <w:tcW w:type="dxa" w:w="3169"/>
-            <w:vAlign w:val="top"/>
-          </w:tcPr>
-          <w:p>
-            <w:pPr>
-              <w:spacing w:after="0"/>
-            </w:pPr>
-            <w:r>
-              <w:rPr>
-                <w:sz w:val="18"/>
-              </w:rPr>
-              <w:t>Cada vez que una historia cambia de estado</w:t>
             </w:r>
           </w:p>
         </w:tc>
@@ -3041,7 +2823,7 @@
               <w:rPr>
                 <w:sz w:val="18"/>
               </w:rPr>
-              <w:t>Pruebas automáticas (848 comprobaciones entre todas las suites), revisión de seguridad por casos de uso y pruebas de ataque contra la base real</w:t>
+              <w:t>Pruebas automáticas (727 comprobaciones entre todas las suites), revisión de seguridad por casos de uso y pruebas de ataque contra la base real</w:t>
             </w:r>
           </w:p>
         </w:tc>
@@ -3138,96 +2920,6 @@
                 <w:sz w:val="18"/>
               </w:rPr>
               <w:t xml:space="preserve"> (base de datos, seguridad, asistente de IA, despliegue)</w:t>
-            </w:r>
-          </w:p>
-        </w:tc>
-      </w:tr>
-    </w:tbl>
-    <w:p>
-      <w:pPr>
-        <w:spacing w:after="0" w:before="0" w:line="120" w:lineRule="exact"/>
-      </w:pPr>
-      <w:r>
-        <w:rPr>
-          <w:sz w:val="12"/>
-        </w:rPr>
-      </w:r>
-    </w:p>
-    <w:p>
-      <w:pPr>
-        <w:pStyle w:val="Heading1"/>
-      </w:pPr>
-      <w:r>
-        <w:t>8. Nota de transparencia</w:t>
-      </w:r>
-    </w:p>
-    <w:tbl>
-      <w:tblPr>
-        <w:tblW w:type="dxa" w:w="9972"/>
-        <w:tblLook w:firstColumn="1" w:firstRow="1" w:lastColumn="0" w:lastRow="0" w:noHBand="0" w:noVBand="1" w:val="04A0"/>
-        <w:tblBorders>
-          <w:top w:val="single" w:sz="6" w:space="0" w:color="C2410C"/>
-          <w:left w:val="single" w:sz="6" w:space="0" w:color="C2410C"/>
-          <w:bottom w:val="single" w:sz="6" w:space="0" w:color="C2410C"/>
-          <w:right w:val="single" w:sz="6" w:space="0" w:color="C2410C"/>
-          <w:insideH w:val="single" w:sz="6" w:space="0" w:color="C2410C"/>
-          <w:insideV w:val="single" w:sz="6" w:space="0" w:color="C2410C"/>
-        </w:tblBorders>
-        <w:tblCellMar>
-          <w:top w:w="100" w:type="dxa"/>
-          <w:left w:w="160" w:type="dxa"/>
-          <w:bottom w:w="100" w:type="dxa"/>
-          <w:right w:w="160" w:type="dxa"/>
-        </w:tblCellMar>
-        <w:tblLayout w:type="fixed"/>
-      </w:tblPr>
-      <w:tblGrid>
-        <w:gridCol w:w="9972"/>
-      </w:tblGrid>
-      <w:tr>
-        <w:trPr>
-          <w:cantSplit/>
-        </w:trPr>
-        <w:tc>
-          <w:tcPr>
-            <w:tcW w:type="dxa" w:w="9972"/>
-            <w:shd w:val="clear" w:color="auto" w:fill="FFF7ED"/>
-          </w:tcPr>
-          <w:p>
-            <w:pPr>
-              <w:spacing w:after="40"/>
-            </w:pPr>
-            <w:r>
-              <w:rPr>
-                <w:sz w:val="21"/>
-              </w:rPr>
-              <w:t xml:space="preserve">El </w:t>
-            </w:r>
-            <w:r>
-              <w:rPr>
-                <w:b/>
-                <w:sz w:val="21"/>
-              </w:rPr>
-              <w:t>Sprint Backlog</w:t>
-            </w:r>
-            <w:r>
-              <w:rPr>
-                <w:sz w:val="21"/>
-              </w:rPr>
-              <w:t xml:space="preserve"> se reconstruyó desde el historial real de Git y las </w:t>
-            </w:r>
-            <w:r>
-              <w:rPr>
-                <w:b/>
-                <w:sz w:val="21"/>
-              </w:rPr>
-              <w:t>retrospectivas</w:t>
-            </w:r>
-            <w:r>
-              <w:rPr>
-                <w:sz w:val="21"/>
-              </w:rPr>
-              <w:t xml:space="preserve"> de las iteraciones 2 a 4 se redactaron el 01-10-2026 a partir de ese historial y de los documentos del proyecto: los hechos y las mejoras son reales, pero no se registraron en una reunión al cierre de cada iteración. Las de las iteraciones 5 y 6 también se redactaron el 10-10-2026 con el mismo criterio. Desde la iteración 7 la retrospectiva se registra al cerrar la iteración.</w:t>
             </w:r>
           </w:p>
         </w:tc>

</xml_diff>